<commit_message>
Entrega final TP 4
</commit_message>
<xml_diff>
--- a/TP4/Program_TP4_Grupo2.docx
+++ b/TP4/Program_TP4_Grupo2.docx
@@ -260,6 +260,142 @@
         </w:rPr>
         <w:cr/>
       </w:r>
+    </w:p>
+    <w:p>
+      <w:pPr>
+        <w:rPr>
+          <w:b/>
+          <w:bCs/>
+          <w:sz w:val="24"/>
+          <w:szCs w:val="24"/>
+        </w:rPr>
+      </w:pPr>
+      <w:r>
+        <w:rPr>
+          <w:b/>
+          <w:bCs/>
+          <w:sz w:val="24"/>
+          <w:szCs w:val="24"/>
+        </w:rPr>
+        <w:t>Introducción</w:t>
+      </w:r>
+    </w:p>
+    <w:p>
+      <w:pPr>
+        <w:ind w:firstLine="284"/>
+        <w:jc w:val="both"/>
+        <w:rPr>
+          <w:sz w:val="24"/>
+          <w:szCs w:val="24"/>
+        </w:rPr>
+      </w:pPr>
+      <w:r>
+        <w:rPr>
+          <w:sz w:val="24"/>
+          <w:szCs w:val="24"/>
+        </w:rPr>
+        <w:t>El presente informe tiene por objetivo evaluar el desempeño predictivo de distintos modelos de clasificación aplicados a la identificación de hogares pobres en Argentina utilizando la base de la EPH para el año 2025. Sobre la matriz de predictores construida en el TP3</w:t>
+      </w:r>
+      <w:r>
+        <w:rPr>
+          <w:sz w:val="24"/>
+          <w:szCs w:val="24"/>
+        </w:rPr>
+        <w:t xml:space="preserve">, </w:t>
+      </w:r>
+      <w:r>
+        <w:rPr>
+          <w:sz w:val="24"/>
+          <w:szCs w:val="24"/>
+        </w:rPr>
+        <w:t>que incluye variables sociodemográficas y económicas seleccionadas por su relevancia teórica y empírica</w:t>
+      </w:r>
+      <w:r>
+        <w:rPr>
+          <w:sz w:val="24"/>
+          <w:szCs w:val="24"/>
+        </w:rPr>
+        <w:t>,</w:t>
+      </w:r>
+      <w:r>
+        <w:rPr>
+          <w:sz w:val="24"/>
+          <w:szCs w:val="24"/>
+        </w:rPr>
+        <w:t xml:space="preserve"> se implementan técnicas de regularización (LASSO y Ridge), modelos de árboles de decisión podados mediante complejidad de costos y se comparan sus resultados con los modelos </w:t>
+      </w:r>
+      <w:proofErr w:type="spellStart"/>
+      <w:r>
+        <w:rPr>
+          <w:sz w:val="24"/>
+          <w:szCs w:val="24"/>
+        </w:rPr>
+        <w:t>benchmark</w:t>
+      </w:r>
+      <w:proofErr w:type="spellEnd"/>
+      <w:r>
+        <w:rPr>
+          <w:sz w:val="24"/>
+          <w:szCs w:val="24"/>
+        </w:rPr>
+        <w:t xml:space="preserve"> del TP3: </w:t>
+      </w:r>
+      <w:proofErr w:type="spellStart"/>
+      <w:r>
+        <w:rPr>
+          <w:sz w:val="24"/>
+          <w:szCs w:val="24"/>
+        </w:rPr>
+        <w:t>Logit</w:t>
+      </w:r>
+      <w:proofErr w:type="spellEnd"/>
+      <w:r>
+        <w:rPr>
+          <w:sz w:val="24"/>
+          <w:szCs w:val="24"/>
+        </w:rPr>
+        <w:t xml:space="preserve"> sin penalidad y KNN con validación cruzada. El análisis se centra tanto en la capacidad predictiva fuera de la muestra como en la interpretación económica de los coeficientes y la importancia de las variables, evaluando métricas como </w:t>
+      </w:r>
+      <w:proofErr w:type="spellStart"/>
+      <w:r>
+        <w:rPr>
+          <w:sz w:val="24"/>
+          <w:szCs w:val="24"/>
+        </w:rPr>
+        <w:t>accuracy</w:t>
+      </w:r>
+      <w:proofErr w:type="spellEnd"/>
+      <w:r>
+        <w:rPr>
+          <w:sz w:val="24"/>
+          <w:szCs w:val="24"/>
+        </w:rPr>
+        <w:t xml:space="preserve">, </w:t>
+      </w:r>
+      <w:proofErr w:type="spellStart"/>
+      <w:r>
+        <w:rPr>
+          <w:sz w:val="24"/>
+          <w:szCs w:val="24"/>
+        </w:rPr>
+        <w:t>recall</w:t>
+      </w:r>
+      <w:proofErr w:type="spellEnd"/>
+      <w:r>
+        <w:rPr>
+          <w:sz w:val="24"/>
+          <w:szCs w:val="24"/>
+        </w:rPr>
+        <w:t>, F1 y AUC.</w:t>
+      </w:r>
+    </w:p>
+    <w:p>
+      <w:pPr>
+        <w:rPr>
+          <w:sz w:val="28"/>
+          <w:szCs w:val="28"/>
+        </w:rPr>
+      </w:pPr>
       <w:r>
         <w:br w:type="page"/>
       </w:r>
@@ -297,47 +433,7 @@
           <w:color w:val="366091"/>
           <w:lang w:val="es-US"/>
         </w:rPr>
-        <w:t xml:space="preserve"> Modelo de </w:t>
-      </w:r>
-      <w:r>
-        <w:rPr>
-          <w:rFonts w:ascii="Arial" w:eastAsia="Century Schoolbook" w:hAnsi="Arial" w:cs="Arial"/>
-          <w:b/>
-          <w:bCs/>
-          <w:color w:val="366091"/>
-          <w:lang w:val="es-US"/>
-        </w:rPr>
-        <w:t>Regresión</w:t>
-      </w:r>
-      <w:r>
-        <w:rPr>
-          <w:rFonts w:ascii="Arial" w:eastAsia="Century Schoolbook" w:hAnsi="Arial" w:cs="Arial"/>
-          <w:b/>
-          <w:bCs/>
-          <w:color w:val="366091"/>
-          <w:lang w:val="es-US"/>
-        </w:rPr>
-        <w:t xml:space="preserve"> </w:t>
-      </w:r>
-      <w:r>
-        <w:rPr>
-          <w:rFonts w:ascii="Arial" w:eastAsia="Century Schoolbook" w:hAnsi="Arial" w:cs="Arial"/>
-          <w:b/>
-          <w:bCs/>
-          <w:color w:val="366091"/>
-          <w:lang w:val="es-US"/>
-        </w:rPr>
-        <w:t>Logística</w:t>
-      </w:r>
-      <w:r>
-        <w:rPr>
-          <w:rFonts w:ascii="Arial" w:eastAsia="Century Schoolbook" w:hAnsi="Arial" w:cs="Arial"/>
-          <w:b/>
-          <w:bCs/>
-          <w:color w:val="366091"/>
-          <w:lang w:val="es-US"/>
-        </w:rPr>
-        <w:t xml:space="preserve"> con Regularización: Ridge y LASSO</w:t>
+        <w:t xml:space="preserve"> Modelo de Regresión Logística con Regularización: Ridge y LASSO</w:t>
       </w:r>
     </w:p>
     <w:p>
@@ -560,7 +656,6 @@
     </w:p>
     <w:p>
       <w:pPr>
-        <w:ind w:firstLine="284"/>
         <w:jc w:val="both"/>
         <w:rPr>
           <w:sz w:val="24"/>
@@ -569,13 +664,14 @@
       </w:pPr>
       <w:r>
         <w:rPr>
+          <w:noProof/>
           <w:sz w:val="24"/>
           <w:szCs w:val="24"/>
         </w:rPr>
         <w:drawing>
-          <wp:inline distT="0" distB="0" distL="0" distR="0" wp14:anchorId="7BF1AE85" wp14:editId="785B4D1F">
-            <wp:extent cx="5731510" cy="2185670"/>
-            <wp:effectExtent l="0" t="0" r="2540" b="5080"/>
+          <wp:inline distT="0" distB="0" distL="0" distR="0" wp14:anchorId="7BF1AE85" wp14:editId="569FDB68">
+            <wp:extent cx="5781600" cy="2204771"/>
+            <wp:effectExtent l="0" t="0" r="0" b="5080"/>
             <wp:docPr id="720036735" name="Imagen 1" descr="Gráfico, Gráfico de líneas&#10;&#10;El contenido generado por IA puede ser incorrecto."/>
             <wp:cNvGraphicFramePr>
               <a:graphicFrameLocks xmlns:a="http://schemas.openxmlformats.org/drawingml/2006/main" noChangeAspect="1"/>
@@ -596,7 +692,7 @@
                   <pic:spPr>
                     <a:xfrm>
                       <a:off x="0" y="0"/>
-                      <a:ext cx="5731510" cy="2185670"/>
+                      <a:ext cx="5781600" cy="2204771"/>
                     </a:xfrm>
                     <a:prstGeom prst="rect">
                       <a:avLst/>
@@ -1021,46 +1117,6 @@
           <w:szCs w:val="24"/>
         </w:rPr>
       </w:pPr>
-      <w:r>
-        <w:rPr>
-          <w:b/>
-          <w:bCs/>
-          <w:color w:val="000000" w:themeColor="text1"/>
-          <w:sz w:val="24"/>
-          <w:szCs w:val="24"/>
-        </w:rPr>
-        <w:t xml:space="preserve">Gráfico </w:t>
-      </w:r>
-      <w:r>
-        <w:rPr>
-          <w:b/>
-          <w:bCs/>
-          <w:color w:val="000000" w:themeColor="text1"/>
-          <w:sz w:val="24"/>
-          <w:szCs w:val="24"/>
-        </w:rPr>
-        <w:t>2.A</w:t>
-      </w:r>
-      <w:r>
-        <w:rPr>
-          <w:b/>
-          <w:bCs/>
-          <w:color w:val="000000" w:themeColor="text1"/>
-          <w:sz w:val="24"/>
-          <w:szCs w:val="24"/>
-        </w:rPr>
-        <w:t xml:space="preserve">: </w:t>
-      </w:r>
-      <w:r>
-        <w:rPr>
-          <w:b/>
-          <w:bCs/>
-          <w:color w:val="000000" w:themeColor="text1"/>
-          <w:sz w:val="24"/>
-          <w:szCs w:val="24"/>
-        </w:rPr>
-        <w:t>Error de clasificación</w:t>
-      </w:r>
     </w:p>
     <w:p>
       <w:pPr>
@@ -1073,6 +1129,66 @@
           <w:szCs w:val="24"/>
         </w:rPr>
       </w:pPr>
+    </w:p>
+    <w:p>
+      <w:pPr>
+        <w:jc w:val="both"/>
+        <w:rPr>
+          <w:b/>
+          <w:bCs/>
+          <w:color w:val="000000" w:themeColor="text1"/>
+          <w:sz w:val="24"/>
+          <w:szCs w:val="24"/>
+        </w:rPr>
+      </w:pPr>
+    </w:p>
+    <w:p>
+      <w:pPr>
+        <w:jc w:val="both"/>
+        <w:rPr>
+          <w:b/>
+          <w:bCs/>
+          <w:color w:val="000000" w:themeColor="text1"/>
+          <w:sz w:val="24"/>
+          <w:szCs w:val="24"/>
+        </w:rPr>
+      </w:pPr>
+    </w:p>
+    <w:p>
+      <w:pPr>
+        <w:jc w:val="both"/>
+        <w:rPr>
+          <w:b/>
+          <w:bCs/>
+          <w:color w:val="000000" w:themeColor="text1"/>
+          <w:sz w:val="24"/>
+          <w:szCs w:val="24"/>
+        </w:rPr>
+      </w:pPr>
+    </w:p>
+    <w:p>
+      <w:pPr>
+        <w:jc w:val="both"/>
+        <w:rPr>
+          <w:b/>
+          <w:bCs/>
+          <w:color w:val="000000" w:themeColor="text1"/>
+          <w:sz w:val="24"/>
+          <w:szCs w:val="24"/>
+        </w:rPr>
+      </w:pPr>
+    </w:p>
+    <w:p>
+      <w:pPr>
+        <w:jc w:val="both"/>
+        <w:rPr>
+          <w:b/>
+          <w:bCs/>
+          <w:color w:val="000000" w:themeColor="text1"/>
+          <w:sz w:val="24"/>
+          <w:szCs w:val="24"/>
+        </w:rPr>
+      </w:pPr>
       <w:r>
         <w:rPr>
           <w:b/>
@@ -1082,10 +1198,63 @@
           <w:szCs w:val="24"/>
         </w:rPr>
         <w:lastRenderedPageBreak/>
+        <w:t xml:space="preserve">Gráfico </w:t>
+      </w:r>
+      <w:r>
+        <w:rPr>
+          <w:b/>
+          <w:bCs/>
+          <w:color w:val="000000" w:themeColor="text1"/>
+          <w:sz w:val="24"/>
+          <w:szCs w:val="24"/>
+        </w:rPr>
+        <w:t>2.A</w:t>
+      </w:r>
+      <w:r>
+        <w:rPr>
+          <w:b/>
+          <w:bCs/>
+          <w:color w:val="000000" w:themeColor="text1"/>
+          <w:sz w:val="24"/>
+          <w:szCs w:val="24"/>
+        </w:rPr>
+        <w:t xml:space="preserve">: </w:t>
+      </w:r>
+      <w:r>
+        <w:rPr>
+          <w:b/>
+          <w:bCs/>
+          <w:color w:val="000000" w:themeColor="text1"/>
+          <w:sz w:val="24"/>
+          <w:szCs w:val="24"/>
+        </w:rPr>
+        <w:t>Error de clasificación</w:t>
+      </w:r>
+    </w:p>
+    <w:p>
+      <w:pPr>
+        <w:jc w:val="both"/>
+        <w:rPr>
+          <w:b/>
+          <w:bCs/>
+          <w:color w:val="000000" w:themeColor="text1"/>
+          <w:sz w:val="24"/>
+          <w:szCs w:val="24"/>
+        </w:rPr>
+      </w:pPr>
+      <w:r>
+        <w:rPr>
+          <w:b/>
+          <w:bCs/>
+          <w:noProof/>
+          <w:color w:val="000000" w:themeColor="text1"/>
+          <w:sz w:val="24"/>
+          <w:szCs w:val="24"/>
+        </w:rPr>
         <w:drawing>
-          <wp:inline distT="0" distB="0" distL="0" distR="0" wp14:anchorId="272C3DC4" wp14:editId="6496BAA8">
-            <wp:extent cx="3609963" cy="1946564"/>
-            <wp:effectExtent l="0" t="0" r="0" b="0"/>
+          <wp:inline distT="0" distB="0" distL="0" distR="0" wp14:anchorId="272C3DC4" wp14:editId="3CAFBD3D">
+            <wp:extent cx="5781675" cy="3117594"/>
+            <wp:effectExtent l="0" t="0" r="0" b="6985"/>
             <wp:docPr id="1031077046" name="Imagen 1" descr="Gráfico, Gráfico de líneas&#10;&#10;El contenido generado por IA puede ser incorrecto."/>
             <wp:cNvGraphicFramePr>
               <a:graphicFrameLocks xmlns:a="http://schemas.openxmlformats.org/drawingml/2006/main" noChangeAspect="1"/>
@@ -1106,7 +1275,7 @@
                   <pic:spPr>
                     <a:xfrm>
                       <a:off x="0" y="0"/>
-                      <a:ext cx="3621383" cy="1952722"/>
+                      <a:ext cx="5807239" cy="3131379"/>
                     </a:xfrm>
                     <a:prstGeom prst="rect">
                       <a:avLst/>
@@ -1156,14 +1325,15 @@
         <w:rPr>
           <w:b/>
           <w:bCs/>
+          <w:noProof/>
           <w:color w:val="000000" w:themeColor="text1"/>
           <w:sz w:val="24"/>
           <w:szCs w:val="24"/>
         </w:rPr>
         <w:drawing>
-          <wp:inline distT="0" distB="0" distL="0" distR="0" wp14:anchorId="13896AC2" wp14:editId="0D948401">
-            <wp:extent cx="3622964" cy="2444977"/>
-            <wp:effectExtent l="0" t="0" r="0" b="0"/>
+          <wp:inline distT="0" distB="0" distL="0" distR="0" wp14:anchorId="13896AC2" wp14:editId="02CAF526">
+            <wp:extent cx="5781600" cy="3901744"/>
+            <wp:effectExtent l="0" t="0" r="0" b="3810"/>
             <wp:docPr id="1678470788" name="Imagen 1" descr="Gráfico, Gráfico de líneas&#10;&#10;El contenido generado por IA puede ser incorrecto."/>
             <wp:cNvGraphicFramePr>
               <a:graphicFrameLocks xmlns:a="http://schemas.openxmlformats.org/drawingml/2006/main" noChangeAspect="1"/>
@@ -1184,7 +1354,7 @@
                   <pic:spPr>
                     <a:xfrm>
                       <a:off x="0" y="0"/>
-                      <a:ext cx="3635755" cy="2453609"/>
+                      <a:ext cx="5781600" cy="3901744"/>
                     </a:xfrm>
                     <a:prstGeom prst="rect">
                       <a:avLst/>
@@ -1222,16 +1392,7 @@
           <w:sz w:val="28"/>
           <w:szCs w:val="28"/>
         </w:rPr>
-        <w:t>A</w:t>
-      </w:r>
-      <w:r>
-        <w:rPr>
-          <w:b/>
-          <w:bCs/>
-          <w:sz w:val="28"/>
-          <w:szCs w:val="28"/>
-        </w:rPr>
-        <w:t>3</w:t>
+        <w:t>A3</w:t>
       </w:r>
     </w:p>
     <w:p>
@@ -1328,7 +1489,16 @@
           <w:szCs w:val="24"/>
           <w:lang w:val="es-PE"/>
         </w:rPr>
-        <w:t xml:space="preserve">. El signo y el orden de importancia de las variables se mantiene prácticamente igual en las tres especificaciones. Por ejemplo, </w:t>
+        <w:t xml:space="preserve">. El signo y el orden de importancia de las variables se mantiene prácticamente igual en las tres </w:t>
+      </w:r>
+      <w:r>
+        <w:rPr>
+          <w:sz w:val="24"/>
+          <w:szCs w:val="24"/>
+          <w:lang w:val="es-PE"/>
+        </w:rPr>
+        <w:lastRenderedPageBreak/>
+        <w:t xml:space="preserve">especificaciones. Por ejemplo, </w:t>
       </w:r>
       <w:r>
         <w:rPr>
@@ -1901,27 +2071,7 @@
           <w:sz w:val="24"/>
           <w:szCs w:val="24"/>
         </w:rPr>
-        <w:t>Tabla 1</w:t>
-      </w:r>
-      <w:r>
-        <w:rPr>
-          <w:b/>
-          <w:bCs/>
-          <w:color w:val="000000" w:themeColor="text1"/>
-          <w:sz w:val="24"/>
-          <w:szCs w:val="24"/>
-        </w:rPr>
-        <w:t xml:space="preserve">: </w:t>
-      </w:r>
-      <w:r>
-        <w:rPr>
-          <w:b/>
-          <w:bCs/>
-          <w:color w:val="000000" w:themeColor="text1"/>
-          <w:sz w:val="24"/>
-          <w:szCs w:val="24"/>
-        </w:rPr>
-        <w:t>Tabla de resultados</w:t>
+        <w:t>Tabla 1: Tabla de resultados</w:t>
       </w:r>
     </w:p>
     <w:tbl>
@@ -2146,7 +2296,6 @@
                 <w:lang w:val="es-PE" w:eastAsia="es-PE"/>
                 <w14:ligatures w14:val="none"/>
               </w:rPr>
-              <w:lastRenderedPageBreak/>
               <w:t>intercept</w:t>
             </w:r>
             <w:proofErr w:type="spellEnd"/>
@@ -3801,6 +3950,22 @@
           <w:sz w:val="24"/>
           <w:szCs w:val="24"/>
           <w:lang w:val="es-PE"/>
+        </w:rPr>
+      </w:pPr>
+    </w:p>
+    <w:p>
+      <w:pPr>
+        <w:spacing w:before="240"/>
+        <w:ind w:right="16"/>
+        <w:jc w:val="both"/>
+        <w:rPr>
+          <w:rFonts w:ascii="Arial" w:eastAsia="Century Schoolbook" w:hAnsi="Arial" w:cs="Arial"/>
+          <w:b/>
+          <w:bCs/>
+          <w:color w:val="366091"/>
+          <w:sz w:val="26"/>
+          <w:szCs w:val="26"/>
+          <w:lang w:val="es-US"/>
         </w:rPr>
       </w:pPr>
     </w:p>
@@ -4314,66 +4479,86 @@
           <w:szCs w:val="24"/>
         </w:rPr>
       </w:pPr>
-      <w:r>
-        <w:rPr>
-          <w:b/>
-          <w:bCs/>
-          <w:color w:val="000000" w:themeColor="text1"/>
-          <w:sz w:val="24"/>
-          <w:szCs w:val="24"/>
-        </w:rPr>
-        <w:t xml:space="preserve">Gráfico </w:t>
-      </w:r>
-      <w:r>
-        <w:rPr>
-          <w:b/>
-          <w:bCs/>
-          <w:color w:val="000000" w:themeColor="text1"/>
-          <w:sz w:val="24"/>
-          <w:szCs w:val="24"/>
-        </w:rPr>
-        <w:t>3</w:t>
-      </w:r>
-      <w:r>
-        <w:rPr>
-          <w:b/>
-          <w:bCs/>
-          <w:color w:val="000000" w:themeColor="text1"/>
-          <w:sz w:val="24"/>
-          <w:szCs w:val="24"/>
-        </w:rPr>
-        <w:t xml:space="preserve">: </w:t>
-      </w:r>
-      <w:r>
-        <w:rPr>
-          <w:b/>
-          <w:bCs/>
-          <w:color w:val="000000" w:themeColor="text1"/>
-          <w:sz w:val="24"/>
-          <w:szCs w:val="24"/>
-        </w:rPr>
-        <w:t>Error de clasificación</w:t>
-      </w:r>
     </w:p>
     <w:p>
       <w:pPr>
         <w:jc w:val="both"/>
         <w:rPr>
-          <w:sz w:val="24"/>
-          <w:szCs w:val="24"/>
-          <w:lang w:val="es-PE"/>
+          <w:b/>
+          <w:bCs/>
+          <w:color w:val="000000" w:themeColor="text1"/>
+          <w:sz w:val="24"/>
+          <w:szCs w:val="24"/>
         </w:rPr>
       </w:pPr>
-      <w:r>
-        <w:rPr>
+    </w:p>
+    <w:p>
+      <w:pPr>
+        <w:jc w:val="both"/>
+        <w:rPr>
+          <w:b/>
+          <w:bCs/>
+          <w:color w:val="000000" w:themeColor="text1"/>
+          <w:sz w:val="24"/>
+          <w:szCs w:val="24"/>
+        </w:rPr>
+      </w:pPr>
+    </w:p>
+    <w:p>
+      <w:pPr>
+        <w:jc w:val="both"/>
+        <w:rPr>
+          <w:b/>
+          <w:bCs/>
+          <w:color w:val="000000" w:themeColor="text1"/>
+          <w:sz w:val="24"/>
+          <w:szCs w:val="24"/>
+        </w:rPr>
+      </w:pPr>
+    </w:p>
+    <w:p>
+      <w:pPr>
+        <w:jc w:val="both"/>
+        <w:rPr>
+          <w:b/>
+          <w:bCs/>
+          <w:color w:val="000000" w:themeColor="text1"/>
+          <w:sz w:val="24"/>
+          <w:szCs w:val="24"/>
+        </w:rPr>
+      </w:pPr>
+      <w:r>
+        <w:rPr>
+          <w:b/>
+          <w:bCs/>
+          <w:color w:val="000000" w:themeColor="text1"/>
+          <w:sz w:val="24"/>
+          <w:szCs w:val="24"/>
+        </w:rPr>
+        <w:lastRenderedPageBreak/>
+        <w:t>Gráfico 3: Error de clasificación</w:t>
+      </w:r>
+    </w:p>
+    <w:p>
+      <w:pPr>
+        <w:jc w:val="both"/>
+        <w:rPr>
+          <w:sz w:val="24"/>
+          <w:szCs w:val="24"/>
+          <w:lang w:val="es-PE"/>
+        </w:rPr>
+      </w:pPr>
+      <w:r>
+        <w:rPr>
+          <w:noProof/>
           <w:sz w:val="24"/>
           <w:szCs w:val="24"/>
           <w:lang w:val="es-PE"/>
         </w:rPr>
         <w:drawing>
-          <wp:inline distT="0" distB="0" distL="0" distR="0" wp14:anchorId="0CD794A6" wp14:editId="4B8231F7">
-            <wp:extent cx="5101780" cy="2763982"/>
-            <wp:effectExtent l="0" t="0" r="3810" b="0"/>
+          <wp:inline distT="0" distB="0" distL="0" distR="0" wp14:anchorId="0CD794A6" wp14:editId="0C8B6187">
+            <wp:extent cx="5781600" cy="3132287"/>
+            <wp:effectExtent l="0" t="0" r="0" b="0"/>
             <wp:docPr id="1026241858" name="Imagen 1" descr="Gráfico, Gráfico de líneas&#10;&#10;El contenido generado por IA puede ser incorrecto."/>
             <wp:cNvGraphicFramePr>
               <a:graphicFrameLocks xmlns:a="http://schemas.openxmlformats.org/drawingml/2006/main" noChangeAspect="1"/>
@@ -4394,7 +4579,7 @@
                   <pic:spPr>
                     <a:xfrm>
                       <a:off x="0" y="0"/>
-                      <a:ext cx="5115100" cy="2771198"/>
+                      <a:ext cx="5781600" cy="3132287"/>
                     </a:xfrm>
                     <a:prstGeom prst="rect">
                       <a:avLst/>
@@ -4409,6 +4594,7 @@
     </w:p>
     <w:p>
       <w:pPr>
+        <w:ind w:firstLine="284"/>
         <w:jc w:val="both"/>
         <w:rPr>
           <w:sz w:val="24"/>
@@ -4682,16 +4868,7 @@
           <w:szCs w:val="24"/>
           <w:lang w:val="es-PE"/>
         </w:rPr>
-        <w:t xml:space="preserve">sigue creciendo, el árbol se poda en exceso </w:t>
-      </w:r>
-      <w:r>
-        <w:rPr>
-          <w:sz w:val="24"/>
-          <w:szCs w:val="24"/>
-          <w:lang w:val="es-PE"/>
-        </w:rPr>
-        <w:lastRenderedPageBreak/>
-        <w:t xml:space="preserve">y el error vuelve a incrementarse de manera </w:t>
+        <w:t xml:space="preserve">sigue creciendo, el árbol se poda en exceso y el error vuelve a incrementarse de manera </w:t>
       </w:r>
       <w:r>
         <w:rPr>
@@ -4719,36 +4896,38 @@
           <w:szCs w:val="28"/>
         </w:rPr>
       </w:pPr>
-      <w:r>
-        <w:rPr>
-          <w:b/>
-          <w:bCs/>
-          <w:sz w:val="28"/>
-          <w:szCs w:val="28"/>
-        </w:rPr>
-        <w:t xml:space="preserve">PARTE </w:t>
-      </w:r>
-      <w:r>
-        <w:rPr>
-          <w:b/>
-          <w:bCs/>
-          <w:sz w:val="28"/>
-          <w:szCs w:val="28"/>
-        </w:rPr>
-        <w:t>B</w:t>
-      </w:r>
-      <w:r>
-        <w:rPr>
-          <w:b/>
-          <w:bCs/>
-          <w:sz w:val="28"/>
-          <w:szCs w:val="28"/>
-        </w:rPr>
-        <w:t>5</w:t>
-      </w:r>
     </w:p>
     <w:p>
       <w:pPr>
+        <w:rPr>
+          <w:b/>
+          <w:bCs/>
+          <w:sz w:val="28"/>
+          <w:szCs w:val="28"/>
+        </w:rPr>
+      </w:pPr>
+      <w:r>
+        <w:rPr>
+          <w:b/>
+          <w:bCs/>
+          <w:sz w:val="28"/>
+          <w:szCs w:val="28"/>
+        </w:rPr>
+        <w:t xml:space="preserve">PARTE </w:t>
+      </w:r>
+      <w:r>
+        <w:rPr>
+          <w:b/>
+          <w:bCs/>
+          <w:sz w:val="28"/>
+          <w:szCs w:val="28"/>
+        </w:rPr>
+        <w:t>B5</w:t>
+      </w:r>
+    </w:p>
+    <w:p>
+      <w:pPr>
+        <w:ind w:firstLine="284"/>
         <w:jc w:val="both"/>
         <w:rPr>
           <w:sz w:val="24"/>
@@ -4911,77 +5090,23 @@
     </w:p>
     <w:p>
       <w:pPr>
+        <w:ind w:firstLine="284"/>
         <w:jc w:val="both"/>
         <w:rPr>
-          <w:b/>
-          <w:bCs/>
-          <w:color w:val="000000" w:themeColor="text1"/>
           <w:sz w:val="24"/>
           <w:szCs w:val="24"/>
         </w:rPr>
       </w:pPr>
-      <w:r>
-        <w:rPr>
-          <w:b/>
-          <w:bCs/>
-          <w:color w:val="000000" w:themeColor="text1"/>
-          <w:sz w:val="24"/>
-          <w:szCs w:val="24"/>
-        </w:rPr>
-        <w:t xml:space="preserve">Gráfico </w:t>
-      </w:r>
-      <w:r>
-        <w:rPr>
-          <w:b/>
-          <w:bCs/>
-          <w:color w:val="000000" w:themeColor="text1"/>
-          <w:sz w:val="24"/>
-          <w:szCs w:val="24"/>
-        </w:rPr>
-        <w:t>4</w:t>
-      </w:r>
-      <w:r>
-        <w:rPr>
-          <w:b/>
-          <w:bCs/>
-          <w:color w:val="000000" w:themeColor="text1"/>
-          <w:sz w:val="24"/>
-          <w:szCs w:val="24"/>
-        </w:rPr>
-        <w:t xml:space="preserve">: </w:t>
-      </w:r>
-      <w:r>
-        <w:rPr>
-          <w:b/>
-          <w:bCs/>
-          <w:color w:val="000000" w:themeColor="text1"/>
-          <w:sz w:val="24"/>
-          <w:szCs w:val="24"/>
-        </w:rPr>
-        <w:t xml:space="preserve">Árbol de decisión podado (CART con </w:t>
-      </w:r>
-      <w:proofErr w:type="spellStart"/>
-      <w:r>
-        <w:rPr>
-          <w:b/>
-          <w:bCs/>
-          <w:color w:val="000000" w:themeColor="text1"/>
-          <w:sz w:val="24"/>
-          <w:szCs w:val="24"/>
-        </w:rPr>
-        <w:t>ccp_alpha</w:t>
-      </w:r>
-      <w:proofErr w:type="spellEnd"/>
-      <w:r>
-        <w:rPr>
-          <w:b/>
-          <w:bCs/>
-          <w:color w:val="000000" w:themeColor="text1"/>
-          <w:sz w:val="24"/>
-          <w:szCs w:val="24"/>
-        </w:rPr>
-        <w:t xml:space="preserve"> óptimo)</w:t>
-      </w:r>
+    </w:p>
+    <w:p>
+      <w:pPr>
+        <w:ind w:firstLine="284"/>
+        <w:jc w:val="both"/>
+        <w:rPr>
+          <w:sz w:val="24"/>
+          <w:szCs w:val="24"/>
+        </w:rPr>
+      </w:pPr>
     </w:p>
     <w:p>
       <w:pPr>
@@ -5002,10 +5127,66 @@
           <w:sz w:val="24"/>
           <w:szCs w:val="24"/>
         </w:rPr>
+        <w:lastRenderedPageBreak/>
+        <w:t xml:space="preserve">Gráfico 4: </w:t>
+      </w:r>
+      <w:r>
+        <w:rPr>
+          <w:b/>
+          <w:bCs/>
+          <w:color w:val="000000" w:themeColor="text1"/>
+          <w:sz w:val="24"/>
+          <w:szCs w:val="24"/>
+        </w:rPr>
+        <w:t xml:space="preserve">Árbol de decisión podado (CART con </w:t>
+      </w:r>
+      <w:proofErr w:type="spellStart"/>
+      <w:r>
+        <w:rPr>
+          <w:b/>
+          <w:bCs/>
+          <w:color w:val="000000" w:themeColor="text1"/>
+          <w:sz w:val="24"/>
+          <w:szCs w:val="24"/>
+        </w:rPr>
+        <w:t>ccp_alpha</w:t>
+      </w:r>
+      <w:proofErr w:type="spellEnd"/>
+      <w:r>
+        <w:rPr>
+          <w:b/>
+          <w:bCs/>
+          <w:color w:val="000000" w:themeColor="text1"/>
+          <w:sz w:val="24"/>
+          <w:szCs w:val="24"/>
+        </w:rPr>
+        <w:t xml:space="preserve"> óptimo)</w:t>
+      </w:r>
+    </w:p>
+    <w:p>
+      <w:pPr>
+        <w:jc w:val="both"/>
+        <w:rPr>
+          <w:b/>
+          <w:bCs/>
+          <w:color w:val="000000" w:themeColor="text1"/>
+          <w:sz w:val="24"/>
+          <w:szCs w:val="24"/>
+        </w:rPr>
+      </w:pPr>
+      <w:r>
+        <w:rPr>
+          <w:b/>
+          <w:bCs/>
+          <w:noProof/>
+          <w:color w:val="000000" w:themeColor="text1"/>
+          <w:sz w:val="24"/>
+          <w:szCs w:val="24"/>
+        </w:rPr>
         <w:drawing>
-          <wp:inline distT="0" distB="0" distL="0" distR="0" wp14:anchorId="03E468C8" wp14:editId="236E99CC">
-            <wp:extent cx="4017818" cy="2239491"/>
-            <wp:effectExtent l="0" t="0" r="1905" b="8890"/>
+          <wp:inline distT="0" distB="0" distL="0" distR="0" wp14:anchorId="03E468C8" wp14:editId="13FC85E2">
+            <wp:extent cx="5781600" cy="3222605"/>
+            <wp:effectExtent l="0" t="0" r="0" b="0"/>
             <wp:docPr id="1729403777" name="Imagen 1" descr="Imagen que contiene Escala de tiempo&#10;&#10;El contenido generado por IA puede ser incorrecto."/>
             <wp:cNvGraphicFramePr>
               <a:graphicFrameLocks xmlns:a="http://schemas.openxmlformats.org/drawingml/2006/main" noChangeAspect="1"/>
@@ -5026,7 +5207,7 @@
                   <pic:spPr>
                     <a:xfrm>
                       <a:off x="0" y="0"/>
-                      <a:ext cx="4022649" cy="2242184"/>
+                      <a:ext cx="5781600" cy="3222605"/>
                     </a:xfrm>
                     <a:prstGeom prst="rect">
                       <a:avLst/>
@@ -5058,27 +5239,7 @@
           <w:sz w:val="24"/>
           <w:szCs w:val="24"/>
         </w:rPr>
-        <w:t xml:space="preserve">Gráfico </w:t>
-      </w:r>
-      <w:r>
-        <w:rPr>
-          <w:b/>
-          <w:bCs/>
-          <w:color w:val="000000" w:themeColor="text1"/>
-          <w:sz w:val="24"/>
-          <w:szCs w:val="24"/>
-        </w:rPr>
-        <w:t>5</w:t>
-      </w:r>
-      <w:r>
-        <w:rPr>
-          <w:b/>
-          <w:bCs/>
-          <w:color w:val="000000" w:themeColor="text1"/>
-          <w:sz w:val="24"/>
-          <w:szCs w:val="24"/>
-        </w:rPr>
-        <w:t xml:space="preserve">: </w:t>
+        <w:t xml:space="preserve">Gráfico 5: </w:t>
       </w:r>
       <w:r>
         <w:rPr>
@@ -5106,13 +5267,14 @@
         <w:rPr>
           <w:b/>
           <w:bCs/>
+          <w:noProof/>
           <w:color w:val="000000" w:themeColor="text1"/>
           <w:sz w:val="24"/>
           <w:szCs w:val="24"/>
         </w:rPr>
         <w:drawing>
-          <wp:inline distT="0" distB="0" distL="0" distR="0" wp14:anchorId="6085E118" wp14:editId="3C2078D7">
-            <wp:extent cx="4384964" cy="2572875"/>
+          <wp:inline distT="0" distB="0" distL="0" distR="0" wp14:anchorId="6085E118" wp14:editId="423974B6">
+            <wp:extent cx="5781600" cy="3392350"/>
             <wp:effectExtent l="0" t="0" r="0" b="0"/>
             <wp:docPr id="831932716" name="Imagen 1" descr="Gráfico&#10;&#10;El contenido generado por IA puede ser incorrecto."/>
             <wp:cNvGraphicFramePr>
@@ -5134,7 +5296,7 @@
                   <pic:spPr>
                     <a:xfrm>
                       <a:off x="0" y="0"/>
-                      <a:ext cx="4388520" cy="2574961"/>
+                      <a:ext cx="5781600" cy="3392350"/>
                     </a:xfrm>
                     <a:prstGeom prst="rect">
                       <a:avLst/>
@@ -5149,6 +5311,7 @@
     </w:p>
     <w:p>
       <w:pPr>
+        <w:ind w:firstLine="284"/>
         <w:jc w:val="both"/>
         <w:rPr>
           <w:color w:val="000000" w:themeColor="text1"/>
@@ -5162,7 +5325,6 @@
           <w:sz w:val="24"/>
           <w:szCs w:val="24"/>
         </w:rPr>
-        <w:lastRenderedPageBreak/>
         <w:t xml:space="preserve">El </w:t>
       </w:r>
       <w:r>
@@ -5259,25 +5421,7 @@
           <w:sz w:val="24"/>
           <w:szCs w:val="24"/>
         </w:rPr>
-        <w:t xml:space="preserve">) y </w:t>
-      </w:r>
-      <w:proofErr w:type="spellStart"/>
-      <w:r>
-        <w:rPr>
-          <w:color w:val="000000" w:themeColor="text1"/>
-          <w:sz w:val="24"/>
-          <w:szCs w:val="24"/>
-        </w:rPr>
-        <w:t>nivel_ed</w:t>
-      </w:r>
-      <w:proofErr w:type="spellEnd"/>
-      <w:r>
-        <w:rPr>
-          <w:color w:val="000000" w:themeColor="text1"/>
-          <w:sz w:val="24"/>
-          <w:szCs w:val="24"/>
-        </w:rPr>
-        <w:t xml:space="preserve"> (</w:t>
+        <w:t>) y nivel_ed (</w:t>
       </w:r>
       <m:oMath>
         <m:r>
@@ -5339,47 +5483,12 @@
           <w:sz w:val="24"/>
           <w:szCs w:val="24"/>
         </w:rPr>
-        <w:t xml:space="preserve">), ch07 y </w:t>
-      </w:r>
-      <w:proofErr w:type="spellStart"/>
-      <w:r>
-        <w:rPr>
-          <w:color w:val="000000" w:themeColor="text1"/>
-          <w:sz w:val="24"/>
-          <w:szCs w:val="24"/>
-        </w:rPr>
-        <w:t>cat_ocup</w:t>
-      </w:r>
-      <w:proofErr w:type="spellEnd"/>
-      <w:r>
-        <w:rPr>
-          <w:color w:val="000000" w:themeColor="text1"/>
-          <w:sz w:val="24"/>
-          <w:szCs w:val="24"/>
-        </w:rPr>
-        <w:t xml:space="preserve"> con importancias ya mucho menores, mientras que variables como </w:t>
-      </w:r>
-      <w:proofErr w:type="spellStart"/>
-      <w:r>
-        <w:rPr>
-          <w:color w:val="000000" w:themeColor="text1"/>
-          <w:sz w:val="24"/>
-          <w:szCs w:val="24"/>
-        </w:rPr>
-        <w:t>cat_inac</w:t>
-      </w:r>
-      <w:proofErr w:type="spellEnd"/>
-      <w:r>
-        <w:rPr>
-          <w:color w:val="000000" w:themeColor="text1"/>
-          <w:sz w:val="24"/>
-          <w:szCs w:val="24"/>
-        </w:rPr>
-        <w:t>, pp10a y otras tienen un aporte casi residual. Esto confirma que el árbol se apoya fuertemente en unas pocas variables clave para decidir los cortes principales.</w:t>
+        <w:t>), ch07 y cat_ocup con importancias ya mucho menores, mientras que variables como cat_inac, pp10a y otras tienen un aporte casi residual. Esto confirma que el árbol se apoya fuertemente en unas pocas variables clave para decidir los cortes principales.</w:t>
       </w:r>
     </w:p>
     <w:p>
       <w:pPr>
+        <w:ind w:firstLine="284"/>
         <w:jc w:val="both"/>
         <w:rPr>
           <w:color w:val="000000" w:themeColor="text1"/>
@@ -5393,6 +5502,7 @@
           <w:sz w:val="24"/>
           <w:szCs w:val="24"/>
         </w:rPr>
+        <w:lastRenderedPageBreak/>
         <w:t xml:space="preserve">Al comparar estas importancias con el modelo LASSO, es importante notar que, con la penalidad óptima </w:t>
       </w:r>
       <m:oMath>
@@ -5632,6 +5742,7 @@
     </w:p>
     <w:p>
       <w:pPr>
+        <w:ind w:firstLine="284"/>
         <w:jc w:val="both"/>
         <w:rPr>
           <w:color w:val="000000" w:themeColor="text1"/>
@@ -5863,37 +5974,7 @@
           <w:sz w:val="24"/>
           <w:szCs w:val="24"/>
         </w:rPr>
-        <w:t xml:space="preserve">Gráfico </w:t>
-      </w:r>
-      <w:r>
-        <w:rPr>
-          <w:b/>
-          <w:bCs/>
-          <w:color w:val="000000" w:themeColor="text1"/>
-          <w:sz w:val="24"/>
-          <w:szCs w:val="24"/>
-        </w:rPr>
-        <w:t>6</w:t>
-      </w:r>
-      <w:r>
-        <w:rPr>
-          <w:b/>
-          <w:bCs/>
-          <w:color w:val="000000" w:themeColor="text1"/>
-          <w:sz w:val="24"/>
-          <w:szCs w:val="24"/>
-        </w:rPr>
-        <w:t xml:space="preserve">: </w:t>
-      </w:r>
-      <w:r>
-        <w:rPr>
-          <w:b/>
-          <w:bCs/>
-          <w:color w:val="000000" w:themeColor="text1"/>
-          <w:sz w:val="24"/>
-          <w:szCs w:val="24"/>
-        </w:rPr>
-        <w:t>Curvas ROC</w:t>
+        <w:t>Gráfico 6: Curvas ROC</w:t>
       </w:r>
     </w:p>
     <w:p>
@@ -5913,9 +5994,9 @@
           <w:szCs w:val="24"/>
         </w:rPr>
         <w:drawing>
-          <wp:inline distT="0" distB="0" distL="0" distR="0" wp14:anchorId="624C7025" wp14:editId="59C41960">
-            <wp:extent cx="3762914" cy="2680855"/>
-            <wp:effectExtent l="0" t="0" r="0" b="5715"/>
+          <wp:inline distT="0" distB="0" distL="0" distR="0" wp14:anchorId="624C7025" wp14:editId="1F2BA791">
+            <wp:extent cx="5781600" cy="4119050"/>
+            <wp:effectExtent l="0" t="0" r="0" b="0"/>
             <wp:docPr id="535016103" name="Imagen 2"/>
             <wp:cNvGraphicFramePr>
               <a:graphicFrameLocks xmlns:a="http://schemas.openxmlformats.org/drawingml/2006/main" noChangeAspect="1"/>
@@ -5945,7 +6026,7 @@
                   <pic:spPr bwMode="auto">
                     <a:xfrm>
                       <a:off x="0" y="0"/>
-                      <a:ext cx="3775202" cy="2689610"/>
+                      <a:ext cx="5781600" cy="4119050"/>
                     </a:xfrm>
                     <a:prstGeom prst="rect">
                       <a:avLst/>
@@ -5970,35 +6051,28 @@
           <w:szCs w:val="24"/>
         </w:rPr>
       </w:pPr>
-      <w:r>
-        <w:rPr>
-          <w:b/>
-          <w:bCs/>
-          <w:color w:val="000000" w:themeColor="text1"/>
-          <w:sz w:val="24"/>
-          <w:szCs w:val="24"/>
-        </w:rPr>
-        <w:t xml:space="preserve">Tabla </w:t>
-      </w:r>
-      <w:r>
-        <w:rPr>
-          <w:b/>
-          <w:bCs/>
-          <w:color w:val="000000" w:themeColor="text1"/>
-          <w:sz w:val="24"/>
-          <w:szCs w:val="24"/>
-        </w:rPr>
-        <w:t>2</w:t>
-      </w:r>
-      <w:r>
-        <w:rPr>
-          <w:b/>
-          <w:bCs/>
-          <w:color w:val="000000" w:themeColor="text1"/>
-          <w:sz w:val="24"/>
-          <w:szCs w:val="24"/>
-        </w:rPr>
-        <w:t>: Tabla de resultados</w:t>
+    </w:p>
+    <w:p>
+      <w:pPr>
+        <w:jc w:val="both"/>
+        <w:rPr>
+          <w:b/>
+          <w:bCs/>
+          <w:color w:val="000000" w:themeColor="text1"/>
+          <w:sz w:val="24"/>
+          <w:szCs w:val="24"/>
+        </w:rPr>
+      </w:pPr>
+      <w:r>
+        <w:rPr>
+          <w:b/>
+          <w:bCs/>
+          <w:color w:val="000000" w:themeColor="text1"/>
+          <w:sz w:val="24"/>
+          <w:szCs w:val="24"/>
+        </w:rPr>
+        <w:lastRenderedPageBreak/>
+        <w:t>Tabla 2: Tabla de resultados</w:t>
       </w:r>
     </w:p>
     <w:tbl>
@@ -6061,7 +6135,6 @@
                 <w:lang w:val="es-PE" w:eastAsia="es-PE"/>
                 <w14:ligatures w14:val="none"/>
               </w:rPr>
-              <w:lastRenderedPageBreak/>
               <w:t>Modelos</w:t>
             </w:r>
           </w:p>
@@ -7219,6 +7292,7 @@
     </w:p>
     <w:p>
       <w:pPr>
+        <w:ind w:firstLine="284"/>
         <w:jc w:val="both"/>
         <w:rPr>
           <w:color w:val="000000" w:themeColor="text1"/>
@@ -7234,25 +7308,7 @@
           <w:szCs w:val="24"/>
           <w:lang w:val="es-PE"/>
         </w:rPr>
-        <w:t>Sin embargo, esa ganancia en desempeño viene con un costo de comunicación. Las regresiones logísticas (sin penalidad, LASSO y Ridge) son mucho más sencillas de explicar: cada coeficiente se interpreta como el efecto de una variable sobre la probabilidad de pobreza, lo que permite construir mensajes claros para tomadores de decisión. El árbol podado, aunque visual, es grande y difícil de resumir en reglas simples; KNN directamente es una “caja negra” que no genera parámetros interpretables. Dado que el aumento en performance de los métodos no lineales es moderado (el error baja de ≈0,344 a ≈0,338), la ventaja predictiva de usar un método no lineal existe pero es acotada, y debe sopesarse contra la necesidad de contar con modelos transparentes y fácilmente comunicable</w:t>
-      </w:r>
-      <w:r>
-        <w:rPr>
-          <w:color w:val="000000" w:themeColor="text1"/>
-          <w:sz w:val="24"/>
-          <w:szCs w:val="24"/>
-          <w:lang w:val="es-PE"/>
-        </w:rPr>
-        <w:t>s</w:t>
-      </w:r>
-      <w:r>
-        <w:rPr>
-          <w:color w:val="000000" w:themeColor="text1"/>
-          <w:sz w:val="24"/>
-          <w:szCs w:val="24"/>
-          <w:lang w:val="es-PE"/>
-        </w:rPr>
-        <w:t>.</w:t>
+        <w:t>Sin embargo, esa ganancia en desempeño viene con un costo de comunicación. Las regresiones logísticas (sin penalidad, LASSO y Ridge) son mucho más sencillas de explicar: cada coeficiente se interpreta como el efecto de una variable sobre la probabilidad de pobreza, lo que permite construir mensajes claros para tomadores de decisión. El árbol podado, aunque visual, es grande y difícil de resumir en reglas simples; KNN directamente es una “caja negra” que no genera parámetros interpretables. Dado que el aumento en performance de los métodos no lineales es moderado (el error baja de ≈0,344 a ≈0,338), la ventaja predictiva de usar un método no lineal existe pero es acotada, y debe sopesarse contra la necesidad de contar con modelos transparentes y fácilmente comunicables.</w:t>
       </w:r>
     </w:p>
     <w:p>
@@ -7280,20 +7336,12 @@
           <w:sz w:val="28"/>
           <w:szCs w:val="28"/>
         </w:rPr>
-        <w:t>C</w:t>
-      </w:r>
-      <w:r>
-        <w:rPr>
-          <w:b/>
-          <w:bCs/>
-          <w:sz w:val="28"/>
-          <w:szCs w:val="28"/>
-        </w:rPr>
-        <w:t>7</w:t>
+        <w:t>C7</w:t>
       </w:r>
     </w:p>
     <w:p>
       <w:pPr>
+        <w:ind w:firstLine="284"/>
         <w:jc w:val="both"/>
         <w:rPr>
           <w:color w:val="000000" w:themeColor="text1"/>
@@ -7424,6 +7472,7 @@
     </w:p>
     <w:p>
       <w:pPr>
+        <w:ind w:firstLine="284"/>
         <w:jc w:val="both"/>
         <w:rPr>
           <w:color w:val="000000" w:themeColor="text1"/>
@@ -7530,6 +7579,7 @@
         <w:docPartUnique/>
       </w:docPartObj>
     </w:sdtPr>
+    <w:sdtEndPr/>
     <w:sdtContent>
       <w:p>
         <w:pPr>
@@ -7604,13 +7654,8 @@
       <w:t>4</w:t>
     </w:r>
     <w:r>
-      <w:t xml:space="preserve"> – Godino, Sulca y </w:t>
+      <w:t xml:space="preserve"> – Godino, Sulca y Alvarez</w:t>
     </w:r>
-    <w:proofErr w:type="spellStart"/>
-    <w:r>
-      <w:t>Alvarez</w:t>
-    </w:r>
-    <w:proofErr w:type="spellEnd"/>
   </w:p>
 </w:hdr>
 </file>

</xml_diff>